<commit_message>
La til font og fargepalett spesifikasjoner.
</commit_message>
<xml_diff>
--- a/Details/TekniskeDetaljer.docx
+++ b/Details/TekniskeDetaljer.docx
@@ -45,10 +45,16 @@
       </w:r>
     </w:p>
     <w:p>
+      <w:pPr>
+        <w:rPr>
+          <w:lang w:val="nb-NO"/>
+        </w:rPr>
+      </w:pPr>
       <w:r>
         <w:rPr>
           <w:b/>
           <w:bCs/>
+          <w:lang w:val="nb-NO"/>
         </w:rPr>
         <w:t>Case:</w:t>
       </w:r>
@@ -56,14 +62,26 @@
         <w:rPr>
           <w:b/>
           <w:bCs/>
+          <w:lang w:val="nb-NO"/>
         </w:rPr>
         <w:t xml:space="preserve"> </w:t>
       </w:r>
       <w:proofErr w:type="spellStart"/>
       <w:r>
-        <w:t>snake_case</w:t>
+        <w:rPr>
+          <w:lang w:val="nb-NO"/>
+        </w:rPr>
+        <w:t>snake_</w:t>
+      </w:r>
+      <w:proofErr w:type="gramStart"/>
+      <w:r>
+        <w:rPr>
+          <w:lang w:val="nb-NO"/>
+        </w:rPr>
+        <w:t>case</w:t>
       </w:r>
       <w:proofErr w:type="spellEnd"/>
+      <w:proofErr w:type="gramEnd"/>
     </w:p>
     <w:p>
       <w:pPr>
@@ -174,6 +192,370 @@
         <w:t>)</w:t>
       </w:r>
     </w:p>
+    <w:p>
+      <w:pPr>
+        <w:rPr>
+          <w:lang w:val="nb-NO"/>
+        </w:rPr>
+      </w:pPr>
+    </w:p>
+    <w:p>
+      <w:pPr>
+        <w:rPr>
+          <w:b/>
+          <w:bCs/>
+          <w:lang w:val="nb-NO"/>
+        </w:rPr>
+      </w:pPr>
+      <w:r>
+        <w:rPr>
+          <w:b/>
+          <w:bCs/>
+          <w:lang w:val="nb-NO"/>
+        </w:rPr>
+        <w:t>Fargepalett:</w:t>
+      </w:r>
+    </w:p>
+    <w:p>
+      <w:pPr>
+        <w:rPr>
+          <w:b/>
+          <w:bCs/>
+          <w:lang w:val="nb-NO"/>
+        </w:rPr>
+      </w:pPr>
+      <w:r>
+        <w:rPr>
+          <w:b/>
+          <w:bCs/>
+          <w:lang w:val="nb-NO"/>
+        </w:rPr>
+        <w:drawing>
+          <wp:inline distT="0" distB="0" distL="0" distR="0" wp14:anchorId="20A01D80" wp14:editId="5D1FD8CE">
+            <wp:extent cx="5731510" cy="567055"/>
+            <wp:effectExtent l="0" t="0" r="2540" b="4445"/>
+            <wp:docPr id="1695762698" name="Picture 1"/>
+            <wp:cNvGraphicFramePr>
+              <a:graphicFrameLocks xmlns:a="http://schemas.openxmlformats.org/drawingml/2006/main" noChangeAspect="1"/>
+            </wp:cNvGraphicFramePr>
+            <a:graphic xmlns:a="http://schemas.openxmlformats.org/drawingml/2006/main">
+              <a:graphicData uri="http://schemas.openxmlformats.org/drawingml/2006/picture">
+                <pic:pic xmlns:pic="http://schemas.openxmlformats.org/drawingml/2006/picture">
+                  <pic:nvPicPr>
+                    <pic:cNvPr id="1695762698" name=""/>
+                    <pic:cNvPicPr/>
+                  </pic:nvPicPr>
+                  <pic:blipFill>
+                    <a:blip r:embed="rId4"/>
+                    <a:stretch>
+                      <a:fillRect/>
+                    </a:stretch>
+                  </pic:blipFill>
+                  <pic:spPr>
+                    <a:xfrm>
+                      <a:off x="0" y="0"/>
+                      <a:ext cx="5731510" cy="567055"/>
+                    </a:xfrm>
+                    <a:prstGeom prst="rect">
+                      <a:avLst/>
+                    </a:prstGeom>
+                  </pic:spPr>
+                </pic:pic>
+              </a:graphicData>
+            </a:graphic>
+          </wp:inline>
+        </w:drawing>
+      </w:r>
+    </w:p>
+    <w:p>
+      <w:pPr>
+        <w:rPr>
+          <w:lang w:val="nb-NO"/>
+        </w:rPr>
+      </w:pPr>
+      <w:r>
+        <w:rPr>
+          <w:lang w:val="nb-NO"/>
+        </w:rPr>
+        <w:t xml:space="preserve">        </w:t>
+      </w:r>
+      <w:r>
+        <w:rPr>
+          <w:lang w:val="nb-NO"/>
+        </w:rPr>
+        <w:t>#</w:t>
+      </w:r>
+      <w:r>
+        <w:rPr>
+          <w:lang w:val="nb-NO"/>
+        </w:rPr>
+        <w:t>7A6563</w:t>
+      </w:r>
+      <w:r>
+        <w:rPr>
+          <w:lang w:val="nb-NO"/>
+        </w:rPr>
+        <w:tab/>
+      </w:r>
+      <w:r>
+        <w:rPr>
+          <w:lang w:val="nb-NO"/>
+        </w:rPr>
+        <w:tab/>
+      </w:r>
+      <w:r>
+        <w:rPr>
+          <w:lang w:val="nb-NO"/>
+        </w:rPr>
+        <w:t>#</w:t>
+      </w:r>
+      <w:r>
+        <w:rPr>
+          <w:lang w:val="nb-NO"/>
+        </w:rPr>
+        <w:t>D3A588</w:t>
+      </w:r>
+      <w:r>
+        <w:rPr>
+          <w:lang w:val="nb-NO"/>
+        </w:rPr>
+        <w:tab/>
+        <w:t xml:space="preserve">        </w:t>
+      </w:r>
+      <w:r>
+        <w:rPr>
+          <w:lang w:val="nb-NO"/>
+        </w:rPr>
+        <w:t>#</w:t>
+      </w:r>
+      <w:r>
+        <w:rPr>
+          <w:lang w:val="nb-NO"/>
+        </w:rPr>
+        <w:t>ECE2D0</w:t>
+      </w:r>
+      <w:r>
+        <w:rPr>
+          <w:lang w:val="nb-NO"/>
+        </w:rPr>
+        <w:t xml:space="preserve">                 </w:t>
+      </w:r>
+      <w:r>
+        <w:rPr>
+          <w:lang w:val="nb-NO"/>
+        </w:rPr>
+        <w:t>#</w:t>
+      </w:r>
+      <w:r>
+        <w:rPr>
+          <w:lang w:val="nb-NO"/>
+        </w:rPr>
+        <w:t>7FD1B9</w:t>
+      </w:r>
+      <w:r>
+        <w:rPr>
+          <w:lang w:val="nb-NO"/>
+        </w:rPr>
+        <w:t xml:space="preserve">                  </w:t>
+      </w:r>
+      <w:r>
+        <w:rPr>
+          <w:lang w:val="nb-NO"/>
+        </w:rPr>
+        <w:t>#</w:t>
+      </w:r>
+      <w:r>
+        <w:rPr>
+          <w:lang w:val="nb-NO"/>
+        </w:rPr>
+        <w:t>E56399</w:t>
+      </w:r>
+    </w:p>
+    <w:p>
+      <w:pPr>
+        <w:rPr>
+          <w:lang w:val="nb-NO"/>
+        </w:rPr>
+      </w:pPr>
+    </w:p>
+    <w:p>
+      <w:pPr>
+        <w:rPr>
+          <w:b/>
+          <w:bCs/>
+          <w:lang w:val="nb-NO"/>
+        </w:rPr>
+      </w:pPr>
+      <w:r>
+        <w:rPr>
+          <w:b/>
+          <w:bCs/>
+          <w:lang w:val="nb-NO"/>
+        </w:rPr>
+        <w:t>Font:</w:t>
+      </w:r>
+    </w:p>
+    <w:p>
+      <w:r>
+        <w:rPr>
+          <w:lang w:val="nb-NO"/>
+        </w:rPr>
+        <w:tab/>
+      </w:r>
+      <w:r>
+        <w:rPr>
+          <w:b/>
+          <w:bCs/>
+        </w:rPr>
+        <w:t>Acid green:</w:t>
+      </w:r>
+      <w:r>
+        <w:t xml:space="preserve"> </w:t>
+      </w:r>
+      <w:r>
+        <w:t xml:space="preserve">&lt;link </w:t>
+      </w:r>
+      <w:proofErr w:type="spellStart"/>
+      <w:r>
+        <w:t>rel</w:t>
+      </w:r>
+      <w:proofErr w:type="spellEnd"/>
+      <w:r>
+        <w:t xml:space="preserve">="stylesheet" </w:t>
+      </w:r>
+      <w:proofErr w:type="spellStart"/>
+      <w:r>
+        <w:t>href</w:t>
+      </w:r>
+      <w:proofErr w:type="spellEnd"/>
+      <w:r>
+        <w:t>="https://use.typekit.net/idz1bdq.css"&gt;</w:t>
+      </w:r>
+    </w:p>
+    <w:p>
+      <w:r>
+        <w:tab/>
+      </w:r>
+      <w:r>
+        <w:tab/>
+      </w:r>
+      <w:r>
+        <w:t>font-family: "acid-green", sans-</w:t>
+      </w:r>
+      <w:proofErr w:type="gramStart"/>
+      <w:r>
+        <w:t>serif;</w:t>
+      </w:r>
+      <w:proofErr w:type="gramEnd"/>
+    </w:p>
+    <w:p>
+      <w:pPr>
+        <w:ind w:left="1440"/>
+      </w:pPr>
+      <w:r>
+        <w:t xml:space="preserve">font-weight: </w:t>
+      </w:r>
+      <w:proofErr w:type="gramStart"/>
+      <w:r>
+        <w:t>400;</w:t>
+      </w:r>
+      <w:proofErr w:type="gramEnd"/>
+    </w:p>
+    <w:p>
+      <w:pPr>
+        <w:ind w:left="1440"/>
+      </w:pPr>
+      <w:r>
+        <w:t xml:space="preserve">font-style: </w:t>
+      </w:r>
+      <w:proofErr w:type="gramStart"/>
+      <w:r>
+        <w:t>normal;</w:t>
+      </w:r>
+      <w:proofErr w:type="gramEnd"/>
+    </w:p>
+    <w:p>
+      <w:pPr>
+        <w:ind w:left="1440"/>
+      </w:pPr>
+    </w:p>
+    <w:p>
+      <w:r>
+        <w:tab/>
+      </w:r>
+      <w:r>
+        <w:rPr>
+          <w:b/>
+          <w:bCs/>
+        </w:rPr>
+        <w:t>New spirit:</w:t>
+      </w:r>
+      <w:r>
+        <w:t xml:space="preserve"> </w:t>
+      </w:r>
+      <w:r>
+        <w:t xml:space="preserve">&lt;link </w:t>
+      </w:r>
+      <w:proofErr w:type="spellStart"/>
+      <w:r>
+        <w:t>rel</w:t>
+      </w:r>
+      <w:proofErr w:type="spellEnd"/>
+      <w:r>
+        <w:t xml:space="preserve">="stylesheet" </w:t>
+      </w:r>
+      <w:proofErr w:type="spellStart"/>
+      <w:r>
+        <w:t>href</w:t>
+      </w:r>
+      <w:proofErr w:type="spellEnd"/>
+      <w:r>
+        <w:t>="https://use.typekit.net/idz1bdq.css"&gt;</w:t>
+      </w:r>
+    </w:p>
+    <w:p>
+      <w:r>
+        <w:tab/>
+      </w:r>
+      <w:r>
+        <w:tab/>
+      </w:r>
+      <w:r>
+        <w:t xml:space="preserve">font-family: "new-spirit", </w:t>
+      </w:r>
+      <w:proofErr w:type="gramStart"/>
+      <w:r>
+        <w:t>serif;</w:t>
+      </w:r>
+      <w:proofErr w:type="gramEnd"/>
+    </w:p>
+    <w:p>
+      <w:pPr>
+        <w:ind w:left="1440"/>
+      </w:pPr>
+      <w:r>
+        <w:t xml:space="preserve">font-weight: </w:t>
+      </w:r>
+      <w:proofErr w:type="gramStart"/>
+      <w:r>
+        <w:t>400;</w:t>
+      </w:r>
+      <w:proofErr w:type="gramEnd"/>
+    </w:p>
+    <w:p>
+      <w:pPr>
+        <w:ind w:left="1440"/>
+      </w:pPr>
+      <w:r>
+        <w:t xml:space="preserve">font-style: </w:t>
+      </w:r>
+      <w:proofErr w:type="gramStart"/>
+      <w:r>
+        <w:t>normal;</w:t>
+      </w:r>
+      <w:proofErr w:type="gramEnd"/>
+    </w:p>
+    <w:p/>
     <w:sectPr>
       <w:pgSz w:w="11906" w:h="16838"/>
       <w:pgMar w:top="1440" w:right="1440" w:bottom="1440" w:left="1440" w:header="708" w:footer="708" w:gutter="0"/>

</xml_diff>